<commit_message>
PR2: Add pull request review screenshot
</commit_message>
<xml_diff>
--- a/Отчёты/Практическая работа №2.docx
+++ b/Отчёты/Практическая работа №2.docx
@@ -183,6 +183,76 @@
     <w:p>
       <w:r>
         <w:t>Слитый PR: https://github.com/FireFly4ik/devops-course-2026/pull/1</w:t>
+      </w:r>
+    </w:p>
+    <w:p>
+      <w:r>
+        <w:br w:type="page"/>
+      </w:r>
+    </w:p>
+    <w:p>
+      <w:pPr>
+        <w:pStyle w:val="Heading1"/>
+      </w:pPr>
+      <w:r>
+        <w:t>Скриншот ревью Pull Request</w:t>
+      </w:r>
+    </w:p>
+    <w:p>
+      <w:pPr>
+        <w:keepNext/>
+      </w:pPr>
+      <w:r>
+        <w:t>На скриншоте показан черновик замечания к файлу hobby.md в PR #1. Статус Pending означает, что ревью в этот момент еще не было отправлено.</w:t>
+      </w:r>
+    </w:p>
+    <w:p>
+      <w:pPr>
+        <w:spacing w:before="100" w:after="100"/>
+        <w:jc w:val="center"/>
+      </w:pPr>
+      <w:r>
+        <w:drawing>
+          <wp:inline xmlns:a="http://schemas.openxmlformats.org/drawingml/2006/main" xmlns:pic="http://schemas.openxmlformats.org/drawingml/2006/picture">
+            <wp:extent cx="5760000" cy="3270235"/>
+            <wp:docPr id="1" name="Picture 1" descr="Черновик замечания ПЕРЕДЕЛАЙ к файлу hobby.md в PR 1 со статусом Pending"/>
+            <wp:cNvGraphicFramePr>
+              <a:graphicFrameLocks noChangeAspect="1"/>
+            </wp:cNvGraphicFramePr>
+            <a:graphic>
+              <a:graphicData uri="http://schemas.openxmlformats.org/drawingml/2006/picture">
+                <pic:pic>
+                  <pic:nvPicPr>
+                    <pic:cNvPr id="0" name="codex-clipboard-0974c9df-c4f9-42fc-acc2-b811e7baea5b.png"/>
+                    <pic:cNvPicPr/>
+                  </pic:nvPicPr>
+                  <pic:blipFill>
+                    <a:blip r:embed="rId9"/>
+                    <a:stretch>
+                      <a:fillRect/>
+                    </a:stretch>
+                  </pic:blipFill>
+                  <pic:spPr>
+                    <a:xfrm>
+                      <a:off x="0" y="0"/>
+                      <a:ext cx="5760000" cy="3270235"/>
+                    </a:xfrm>
+                    <a:prstGeom prst="rect"/>
+                  </pic:spPr>
+                </pic:pic>
+              </a:graphicData>
+            </a:graphic>
+          </wp:inline>
+        </w:drawing>
+      </w:r>
+    </w:p>
+    <w:p>
+      <w:pPr>
+        <w:spacing w:after="80"/>
+        <w:jc w:val="center"/>
+      </w:pPr>
+      <w:r>
+        <w:t>Рисунок 1 — Черновик замечания к PR #1</w:t>
       </w:r>
     </w:p>
     <w:sectPr>

</xml_diff>